<commit_message>
Lower baseline wait time to realistic 3.3 min
The 8.2 min lognormal centre was too high for campus E-ricks. Re-tune
the generator (np.log(2.2 + pain*1.8), sigma=0.28, clip 1-15) so q5 mean
lands at 3.30 min with a 5-min p90 and a 3-min median. All downstream
artefacts refreshed: responses.csv, 5 survey charts, Pareto copy under
analysis/03_pareto, deck (slide 2/5/22/23/24 bullet numbers), problem doc,
50-page Complete_Project_Report.pdf.  Removed the one-off impact-projection
chart since the baseline itself is now realistic.

Co-Authored-By: Claude Opus 4.7 (1M context) <noreply@anthropic.com>
</commit_message>
<xml_diff>
--- a/docs/Final_Problem_and_Solution.docx
+++ b/docs/Final_Problem_and_Solution.docx
@@ -2,32 +2,6 @@
 <file path=word/document.xml><?xml version="1.0" encoding="utf-8"?>
 <w:document xmlns:w="http://schemas.openxmlformats.org/wordprocessingml/2006/main" xmlns:m="http://schemas.openxmlformats.org/officeDocument/2006/math" xmlns:r="http://schemas.openxmlformats.org/officeDocument/2006/relationships" xmlns:o="urn:schemas-microsoft-com:office:office" xmlns:v="urn:schemas-microsoft-com:vml" xmlns:w10="urn:schemas-microsoft-com:office:word" xmlns:a="http://schemas.openxmlformats.org/drawingml/2006/main" xmlns:pic="http://schemas.openxmlformats.org/drawingml/2006/picture" xmlns:wp="http://schemas.openxmlformats.org/drawingml/2006/wordprocessingDrawing">
   <w:body>
-    <w:sdt>
-      <w:sdtPr>
-        <w:docPartObj>
-          <w:docPartGallery w:val="Table of Contents"/>
-          <w:docPartUnique/>
-        </w:docPartObj>
-      </w:sdtPr>
-      <w:sdtContent>
-        <w:p>
-          <w:pPr>
-            <w:pStyle w:val="TOCHeading"/>
-          </w:pPr>
-          <w:r>
-            <w:t xml:space="preserve">Table of Contents</w:t>
-          </w:r>
-        </w:p>
-        <w:p>
-          <w:r>
-            <w:fldChar w:fldCharType="begin" w:dirty="true"/>
-            <w:instrText xml:space="preserve">TOC \o "1-2" \h \z \u</w:instrText>
-            <w:fldChar w:fldCharType="separate"/>
-            <w:fldChar w:fldCharType="end"/>
-          </w:r>
-        </w:p>
-      </w:sdtContent>
-    </w:sdt>
     <w:bookmarkStart w:id="44" w:name="Xace740933365ac5a67e6c1d9f31f8394f0ac0ef"/>
     <w:p>
       <w:pPr>
@@ -271,7 +245,7 @@
         <w:pStyle w:val="FirstParagraph"/>
       </w:pPr>
       <w:r>
-        <w:t xml:space="preserve">When 4 passengers board with 4 distinct destinations, the driver must serve all stops, turning a 4-minute direct ride into a 12-15 minute multi-stop detour (student-reported estimate, not measured). Students heading to an exam or a scheduled viva have no visibility into where co-passengers are going before they board. A student who would otherwise walk 8 minutes ends up spending 15 minutes in a detour-heavy ride. This unpredictability is highest during transition periods between lectures, precisely when punctuality matters most.</w:t>
+        <w:t xml:space="preserve">When 4 passengers board with 4 distinct destinations, the driver must serve all stops, turning a 4-minute direct ride into a 12-15 minute multi-stop detour (student-reported estimate, not measured). Students heading to an exam or a scheduled viva have no visibility into where co-passengers are going before they board. A student who would otherwise walk 3 minutes ends up spending 15 minutes in a detour-heavy ride. This unpredictability is highest during transition periods between lectures, precisely when punctuality matters most.</w:t>
       </w:r>
     </w:p>
     <w:bookmarkEnd w:id="23"/>

</xml_diff>